<commit_message>
Devpost: Roots repo is public; video comes from another chat
Co-Authored-By: Claude Opus 5.5 <noreply@anthropic.com>
</commit_message>
<xml_diff>
--- a/submission/Roots-Devpost.docx
+++ b/submission/Roots-Devpost.docx
@@ -2034,19 +2034,7 @@
         <w:t xml:space="preserve"> </w:t>
       </w:r>
       <w:r>
-        <w:t xml:space="preserve">- No PR is open to Garden-Steward yet. Roots itself is not published, and there is no hosted URL for the version shown. If Roots stays unpublished, add this line to the story:</w:t>
-      </w:r>
-      <w:r>
-        <w:t xml:space="preserve"> </w:t>
-      </w:r>
-      <w:r>
-        <w:t xml:space="preserve">“Roots is shown running live at judging. The repository is available to the Guild on request.”</w:t>
-      </w:r>
-      <w:r>
-        <w:t xml:space="preserve"> </w:t>
-      </w:r>
-      <w:r>
-        <w:t xml:space="preserve">- If Josh publishes Roots: the repo tracks 35 files, and none have env, secret, token or database-style names (file names checked, not contents). Leave out the untracked submission/ folder and today-a-wide-20261025.png unless intended.</w:t>
+        <w:t xml:space="preserve">- All three are public. No PR is open to Garden-Steward; the onboarding work lives on the forks.</w:t>
       </w:r>
     </w:p>
     <w:p>
@@ -2064,7 +2052,7 @@
         <w:t xml:space="preserve"> </w:t>
       </w:r>
       <w:r>
-        <w:t xml:space="preserve">TO CONFIRM (optional). Judging uses the live demo. If time is short, skip it. If you record one, an unlisted upload keeps exposure low.</w:t>
+        <w:t xml:space="preserve">Josh has the video from another chat. Paste its link here.</w:t>
       </w:r>
     </w:p>
     <w:p>

</xml_diff>

<commit_message>
Live dashboard link: roots-ebpg.vercel.app
Co-Authored-By: Claude Opus 5.5 <noreply@anthropic.com>
</commit_message>
<xml_diff>
--- a/submission/Roots-Devpost.docx
+++ b/submission/Roots-Devpost.docx
@@ -1285,7 +1285,7 @@
         <w:t xml:space="preserve"> </w:t>
       </w:r>
       <w:r>
-        <w:t xml:space="preserve">- The version shown runs locally on a laptop. It is not hosted. An earlier static demo of the Codex base was published by Codex. It has no assistant, Telegram or benefits layer.</w:t>
+        <w:t xml:space="preserve">- The dashboard is hosted at https://roots-ebpg.vercel.app. The AI assistant and Telegram bots run from the laptop during the demo. An earlier static demo of the Codex base was published by Codex. It has no assistant, Telegram or benefits layer.</w:t>
       </w:r>
       <w:r>
         <w:t xml:space="preserve"> </w:t>
@@ -2016,7 +2016,13 @@
         <w:t xml:space="preserve"> </w:t>
       </w:r>
       <w:r>
-        <w:t xml:space="preserve">- Roots dashboard (public): https://github.com/jmadeiros/roots</w:t>
+        <w:t xml:space="preserve">- Roots live dashboard: https://roots-ebpg.vercel.app (the dashboard; the AI assistant and Telegram run locally at the demo)</w:t>
+      </w:r>
+      <w:r>
+        <w:t xml:space="preserve"> </w:t>
+      </w:r>
+      <w:r>
+        <w:t xml:space="preserve">- Roots code (public): https://github.com/jmadeiros/roots</w:t>
       </w:r>
       <w:r>
         <w:t xml:space="preserve"> </w:t>

</xml_diff>